<commit_message>
Recibo: troca fonte Microsoft Himalaya por Times New Roman 12pt
O template usava "Microsoft Himalaya" 18pt (fonte só do Windows, cujas
letras latinas saem pequenas — por isso parecia normal no Word). No
servidor o LibreOffice não tem essa fonte e substituía por uma fonte
normal em 18pt, deixando o texto enorme e jogando nome/CPF pra 2a folha.

Agora usa Times New Roman 12pt (vira Liberation Serif no Linux, métrica
idêntica): tamanho normal e nome/CPF voltam pra 1a folha junto da
assinatura. Navio segue na 2a folha, como no original.

Co-Authored-By: Claude Opus 4.8 <noreply@anthropic.com>
</commit_message>
<xml_diff>
--- a/src/lib/templates/recibo-pagamento-template.docx
+++ b/src/lib/templates/recibo-pagamento-template.docx
@@ -77,407 +77,407 @@
       <w:pPr>
         <w:jc w:val="both"/>
         <w:rPr>
-          <w:rFonts w:ascii="Microsoft Himalaya" w:hAnsi="Microsoft Himalaya" w:cs="Microsoft Himalaya"/>
+          <w:rFonts w:ascii="Times New Roman" w:hAnsi="Times New Roman" w:cs="Times New Roman"/>
           <w:color w:val="000000"/>
-          <w:sz w:val="36"/>
-          <w:szCs w:val="36"/>
+          <w:sz w:val="24"/>
+          <w:szCs w:val="24"/>
           <w:lang w:val="pt-BR" w:eastAsia="pt-BR"/>
         </w:rPr>
       </w:pPr>
       <w:r>
         <w:rPr>
-          <w:rFonts w:ascii="Microsoft Himalaya" w:hAnsi="Microsoft Himalaya" w:cs="Microsoft Himalaya"/>
-          <w:sz w:val="36"/>
-          <w:szCs w:val="36"/>
+          <w:rFonts w:ascii="Times New Roman" w:hAnsi="Times New Roman" w:cs="Times New Roman"/>
+          <w:sz w:val="24"/>
+          <w:szCs w:val="24"/>
           <w:lang w:val="pt-BR"/>
         </w:rPr>
         <w:t xml:space="preserve">Eu, </w:t>
       </w:r>
       <w:r>
         <w:rPr>
-          <w:rFonts w:ascii="Microsoft Himalaya" w:hAnsi="Microsoft Himalaya" w:cs="Microsoft Himalaya"/>
-          <w:sz w:val="36"/>
-          <w:szCs w:val="36"/>
+          <w:rFonts w:ascii="Times New Roman" w:hAnsi="Times New Roman" w:cs="Times New Roman"/>
+          <w:sz w:val="24"/>
+          <w:szCs w:val="24"/>
           <w:lang w:val="pt-BR"/>
         </w:rPr>
         <w:t/>
       </w:r>
       <w:r>
         <w:rPr>
-          <w:rFonts w:ascii="Microsoft Himalaya" w:hAnsi="Microsoft Himalaya" w:cs="Microsoft Himalaya"/>
-          <w:sz w:val="36"/>
-          <w:szCs w:val="36"/>
+          <w:rFonts w:ascii="Times New Roman" w:hAnsi="Times New Roman" w:cs="Times New Roman"/>
+          <w:sz w:val="24"/>
+          <w:szCs w:val="24"/>
           <w:lang w:val="pt-BR"/>
         </w:rPr>
         <w:t>{NOME},</w:t>
       </w:r>
       <w:r>
         <w:rPr>
-          <w:rFonts w:ascii="Microsoft Himalaya" w:hAnsi="Microsoft Himalaya" w:cs="Microsoft Himalaya"/>
-          <w:sz w:val="36"/>
-          <w:szCs w:val="36"/>
+          <w:rFonts w:ascii="Times New Roman" w:hAnsi="Times New Roman" w:cs="Times New Roman"/>
+          <w:sz w:val="24"/>
+          <w:szCs w:val="24"/>
           <w:lang w:val="pt-BR"/>
         </w:rPr>
         <w:t/>
       </w:r>
       <w:r>
         <w:rPr>
-          <w:rFonts w:ascii="Microsoft Himalaya" w:hAnsi="Microsoft Himalaya" w:cs="Microsoft Himalaya"/>
-          <w:sz w:val="36"/>
-          <w:szCs w:val="36"/>
+          <w:rFonts w:ascii="Times New Roman" w:hAnsi="Times New Roman" w:cs="Times New Roman"/>
+          <w:sz w:val="24"/>
+          <w:szCs w:val="24"/>
           <w:lang w:val="pt-BR"/>
         </w:rPr>
         <w:t xml:space="preserve"> CPF: </w:t>
       </w:r>
       <w:r>
         <w:rPr>
-          <w:rFonts w:ascii="Microsoft Himalaya" w:hAnsi="Microsoft Himalaya" w:cs="Microsoft Himalaya"/>
-          <w:sz w:val="36"/>
-          <w:szCs w:val="36"/>
+          <w:rFonts w:ascii="Times New Roman" w:hAnsi="Times New Roman" w:cs="Times New Roman"/>
+          <w:sz w:val="24"/>
+          <w:szCs w:val="24"/>
           <w:lang w:val="pt-BR"/>
         </w:rPr>
         <w:t/>
       </w:r>
       <w:r>
         <w:rPr>
-          <w:rFonts w:ascii="Microsoft Himalaya" w:hAnsi="Microsoft Himalaya" w:cs="Microsoft Himalaya"/>
+          <w:rFonts w:ascii="Times New Roman" w:hAnsi="Times New Roman" w:cs="Times New Roman"/>
           <w:color w:val="000000"/>
-          <w:sz w:val="36"/>
-          <w:szCs w:val="36"/>
+          <w:sz w:val="24"/>
+          <w:szCs w:val="24"/>
           <w:lang w:val="pt-BR" w:eastAsia="pt-BR"/>
         </w:rPr>
         <w:t>{CPF}</w:t>
       </w:r>
       <w:r>
         <w:rPr>
-          <w:rFonts w:ascii="Microsoft Himalaya" w:hAnsi="Microsoft Himalaya" w:cs="Microsoft Himalaya"/>
+          <w:rFonts w:ascii="Times New Roman" w:hAnsi="Times New Roman" w:cs="Times New Roman"/>
           <w:color w:val="000000"/>
-          <w:sz w:val="36"/>
-          <w:szCs w:val="36"/>
+          <w:sz w:val="24"/>
+          <w:szCs w:val="24"/>
           <w:lang w:val="pt-BR" w:eastAsia="pt-BR"/>
         </w:rPr>
         <w:t/>
       </w:r>
       <w:r>
         <w:rPr>
-          <w:rFonts w:ascii="Microsoft Himalaya" w:hAnsi="Microsoft Himalaya" w:cs="Microsoft Himalaya"/>
-          <w:sz w:val="36"/>
-          <w:szCs w:val="36"/>
+          <w:rFonts w:ascii="Times New Roman" w:hAnsi="Times New Roman" w:cs="Times New Roman"/>
+          <w:sz w:val="24"/>
+          <w:szCs w:val="24"/>
           <w:lang w:val="pt-BR"/>
         </w:rPr>
         <w:t xml:space="preserve">. Recebi da empresa Cargo Ships Cleaning Ltda, CNPJ: 41.560.212/0001-00, a importância de </w:t>
       </w:r>
       <w:r>
         <w:rPr>
-          <w:rFonts w:ascii="Microsoft Himalaya" w:hAnsi="Microsoft Himalaya" w:cs="Microsoft Himalaya"/>
-          <w:sz w:val="36"/>
-          <w:szCs w:val="36"/>
+          <w:rFonts w:ascii="Times New Roman" w:hAnsi="Times New Roman" w:cs="Times New Roman"/>
+          <w:sz w:val="24"/>
+          <w:szCs w:val="24"/>
           <w:lang w:val="pt-BR"/>
         </w:rPr>
         <w:t/>
       </w:r>
       <w:r>
         <w:rPr>
-          <w:rFonts w:ascii="Microsoft Himalaya" w:hAnsi="Microsoft Himalaya" w:cs="Microsoft Himalaya"/>
-          <w:sz w:val="36"/>
-          <w:szCs w:val="36"/>
+          <w:rFonts w:ascii="Times New Roman" w:hAnsi="Times New Roman" w:cs="Times New Roman"/>
+          <w:sz w:val="24"/>
+          <w:szCs w:val="24"/>
           <w:lang w:val="pt-BR"/>
         </w:rPr>
         <w:t>R$</w:t>
       </w:r>
       <w:r>
         <w:rPr>
-          <w:rFonts w:ascii="Microsoft Himalaya" w:hAnsi="Microsoft Himalaya" w:cs="Microsoft Himalaya"/>
-          <w:sz w:val="36"/>
-          <w:szCs w:val="36"/>
+          <w:rFonts w:ascii="Times New Roman" w:hAnsi="Times New Roman" w:cs="Times New Roman"/>
+          <w:sz w:val="24"/>
+          <w:szCs w:val="24"/>
           <w:lang w:val="pt-BR"/>
         </w:rPr>
         <w:t xml:space="preserve"> </w:t>
       </w:r>
       <w:r>
         <w:rPr>
-          <w:rFonts w:ascii="Microsoft Himalaya" w:hAnsi="Microsoft Himalaya" w:cs="Microsoft Himalaya"/>
-          <w:sz w:val="36"/>
-          <w:szCs w:val="36"/>
+          <w:rFonts w:ascii="Times New Roman" w:hAnsi="Times New Roman" w:cs="Times New Roman"/>
+          <w:sz w:val="24"/>
+          <w:szCs w:val="24"/>
           <w:lang w:val="pt-BR"/>
         </w:rPr>
         <w:t>{VALOR}</w:t>
       </w:r>
       <w:r>
         <w:rPr>
-          <w:rFonts w:ascii="Microsoft Himalaya" w:hAnsi="Microsoft Himalaya" w:cs="Microsoft Himalaya"/>
-          <w:sz w:val="36"/>
-          <w:szCs w:val="36"/>
+          <w:rFonts w:ascii="Times New Roman" w:hAnsi="Times New Roman" w:cs="Times New Roman"/>
+          <w:sz w:val="24"/>
+          <w:szCs w:val="24"/>
           <w:lang w:val="pt-BR"/>
         </w:rPr>
         <w:t/>
       </w:r>
       <w:r>
         <w:rPr>
-          <w:rFonts w:ascii="Microsoft Himalaya" w:hAnsi="Microsoft Himalaya" w:cs="Microsoft Himalaya"/>
-          <w:sz w:val="36"/>
-          <w:szCs w:val="36"/>
+          <w:rFonts w:ascii="Times New Roman" w:hAnsi="Times New Roman" w:cs="Times New Roman"/>
+          <w:sz w:val="24"/>
+          <w:szCs w:val="24"/>
           <w:lang w:val="pt-BR"/>
         </w:rPr>
         <w:t xml:space="preserve"> </w:t>
       </w:r>
       <w:r>
         <w:rPr>
-          <w:rFonts w:ascii="Microsoft Himalaya" w:hAnsi="Microsoft Himalaya" w:cs="Microsoft Himalaya"/>
-          <w:sz w:val="36"/>
-          <w:szCs w:val="36"/>
+          <w:rFonts w:ascii="Times New Roman" w:hAnsi="Times New Roman" w:cs="Times New Roman"/>
+          <w:sz w:val="24"/>
+          <w:szCs w:val="24"/>
           <w:lang w:val="pt-BR"/>
         </w:rPr>
         <w:t xml:space="preserve"/>
       </w:r>
       <w:r>
         <w:rPr>
-          <w:rFonts w:ascii="Microsoft Himalaya" w:hAnsi="Microsoft Himalaya" w:cs="Microsoft Himalaya"/>
-          <w:sz w:val="36"/>
-          <w:szCs w:val="36"/>
+          <w:rFonts w:ascii="Times New Roman" w:hAnsi="Times New Roman" w:cs="Times New Roman"/>
+          <w:sz w:val="24"/>
+          <w:szCs w:val="24"/>
           <w:lang w:val="pt-BR"/>
         </w:rPr>
         <w:t xml:space="preserve"/>
       </w:r>
       <w:r>
         <w:rPr>
-          <w:rFonts w:ascii="Microsoft Himalaya" w:hAnsi="Microsoft Himalaya" w:cs="Microsoft Himalaya"/>
-          <w:sz w:val="36"/>
-          <w:szCs w:val="36"/>
+          <w:rFonts w:ascii="Times New Roman" w:hAnsi="Times New Roman" w:cs="Times New Roman"/>
+          <w:sz w:val="24"/>
+          <w:szCs w:val="24"/>
           <w:lang w:val="pt-BR"/>
         </w:rPr>
         <w:t xml:space="preserve"/>
       </w:r>
       <w:r>
         <w:rPr>
-          <w:rFonts w:ascii="Microsoft Himalaya" w:hAnsi="Microsoft Himalaya" w:cs="Microsoft Himalaya"/>
-          <w:sz w:val="36"/>
-          <w:szCs w:val="36"/>
+          <w:rFonts w:ascii="Times New Roman" w:hAnsi="Times New Roman" w:cs="Times New Roman"/>
+          <w:sz w:val="24"/>
+          <w:szCs w:val="24"/>
           <w:lang w:val="pt-BR"/>
         </w:rPr>
         <w:t xml:space="preserve"/>
       </w:r>
       <w:r>
         <w:rPr>
-          <w:rFonts w:ascii="Microsoft Himalaya" w:hAnsi="Microsoft Himalaya" w:cs="Microsoft Himalaya"/>
-          <w:sz w:val="36"/>
-          <w:szCs w:val="36"/>
+          <w:rFonts w:ascii="Times New Roman" w:hAnsi="Times New Roman" w:cs="Times New Roman"/>
+          <w:sz w:val="24"/>
+          <w:szCs w:val="24"/>
           <w:lang w:val="pt-BR"/>
         </w:rPr>
         <w:t xml:space="preserve"/>
       </w:r>
       <w:r>
         <w:rPr>
-          <w:rFonts w:ascii="Microsoft Himalaya" w:hAnsi="Microsoft Himalaya" w:cs="Microsoft Himalaya"/>
-          <w:sz w:val="36"/>
-          <w:szCs w:val="36"/>
+          <w:rFonts w:ascii="Times New Roman" w:hAnsi="Times New Roman" w:cs="Times New Roman"/>
+          <w:sz w:val="24"/>
+          <w:szCs w:val="24"/>
           <w:lang w:val="pt-BR"/>
         </w:rPr>
         <w:t xml:space="preserve"/>
       </w:r>
       <w:r>
         <w:rPr>
-          <w:rFonts w:ascii="Microsoft Himalaya" w:hAnsi="Microsoft Himalaya" w:cs="Microsoft Himalaya"/>
-          <w:sz w:val="36"/>
-          <w:szCs w:val="36"/>
+          <w:rFonts w:ascii="Times New Roman" w:hAnsi="Times New Roman" w:cs="Times New Roman"/>
+          <w:sz w:val="24"/>
+          <w:szCs w:val="24"/>
           <w:lang w:val="pt-BR"/>
         </w:rPr>
         <w:t>(</w:t>
       </w:r>
       <w:r>
         <w:rPr>
-          <w:rFonts w:ascii="Microsoft Himalaya" w:hAnsi="Microsoft Himalaya" w:cs="Microsoft Himalaya"/>
-          <w:sz w:val="36"/>
-          <w:szCs w:val="36"/>
+          <w:rFonts w:ascii="Times New Roman" w:hAnsi="Times New Roman" w:cs="Times New Roman"/>
+          <w:sz w:val="24"/>
+          <w:szCs w:val="24"/>
           <w:lang w:val="pt-BR"/>
         </w:rPr>
         <w:t xml:space="preserve"/>
       </w:r>
       <w:r>
         <w:rPr>
-          <w:rFonts w:ascii="Microsoft Himalaya" w:hAnsi="Microsoft Himalaya" w:cs="Microsoft Himalaya"/>
-          <w:sz w:val="36"/>
-          <w:szCs w:val="36"/>
+          <w:rFonts w:ascii="Times New Roman" w:hAnsi="Times New Roman" w:cs="Times New Roman"/>
+          <w:sz w:val="24"/>
+          <w:szCs w:val="24"/>
           <w:lang w:val="pt-BR"/>
         </w:rPr>
         <w:t xml:space="preserve"/>
       </w:r>
       <w:r>
         <w:rPr>
-          <w:rFonts w:ascii="Microsoft Himalaya" w:hAnsi="Microsoft Himalaya" w:cs="Microsoft Himalaya"/>
-          <w:sz w:val="36"/>
-          <w:szCs w:val="36"/>
+          <w:rFonts w:ascii="Times New Roman" w:hAnsi="Times New Roman" w:cs="Times New Roman"/>
+          <w:sz w:val="24"/>
+          <w:szCs w:val="24"/>
           <w:lang w:val="pt-BR"/>
         </w:rPr>
         <w:t xml:space="preserve"/>
       </w:r>
       <w:r>
         <w:rPr>
-          <w:rFonts w:ascii="Microsoft Himalaya" w:hAnsi="Microsoft Himalaya" w:cs="Microsoft Himalaya"/>
-          <w:sz w:val="36"/>
-          <w:szCs w:val="36"/>
+          <w:rFonts w:ascii="Times New Roman" w:hAnsi="Times New Roman" w:cs="Times New Roman"/>
+          <w:sz w:val="24"/>
+          <w:szCs w:val="24"/>
           <w:lang w:val="pt-BR"/>
         </w:rPr>
         <w:t/>
       </w:r>
       <w:r>
         <w:rPr>
-          <w:rFonts w:ascii="Microsoft Himalaya" w:hAnsi="Microsoft Himalaya" w:cs="Microsoft Himalaya"/>
-          <w:sz w:val="36"/>
-          <w:szCs w:val="36"/>
+          <w:rFonts w:ascii="Times New Roman" w:hAnsi="Times New Roman" w:cs="Times New Roman"/>
+          <w:sz w:val="24"/>
+          <w:szCs w:val="24"/>
           <w:lang w:val="pt-BR"/>
         </w:rPr>
         <w:t xml:space="preserve"/>
       </w:r>
       <w:r>
         <w:rPr>
-          <w:rFonts w:ascii="Microsoft Himalaya" w:hAnsi="Microsoft Himalaya" w:cs="Microsoft Himalaya"/>
-          <w:sz w:val="36"/>
-          <w:szCs w:val="36"/>
+          <w:rFonts w:ascii="Times New Roman" w:hAnsi="Times New Roman" w:cs="Times New Roman"/>
+          <w:sz w:val="24"/>
+          <w:szCs w:val="24"/>
           <w:lang w:val="pt-BR"/>
         </w:rPr>
         <w:t xml:space="preserve">{EXTENSO}</w:t>
       </w:r>
       <w:r>
         <w:rPr>
-          <w:rFonts w:ascii="Microsoft Himalaya" w:hAnsi="Microsoft Himalaya" w:cs="Microsoft Himalaya"/>
-          <w:sz w:val="36"/>
-          <w:szCs w:val="36"/>
+          <w:rFonts w:ascii="Times New Roman" w:hAnsi="Times New Roman" w:cs="Times New Roman"/>
+          <w:sz w:val="24"/>
+          <w:szCs w:val="24"/>
           <w:lang w:val="pt-BR"/>
         </w:rPr>
         <w:t xml:space="preserve"/>
       </w:r>
       <w:r>
         <w:rPr>
-          <w:rFonts w:ascii="Microsoft Himalaya" w:hAnsi="Microsoft Himalaya" w:cs="Microsoft Himalaya"/>
-          <w:sz w:val="36"/>
-          <w:szCs w:val="36"/>
+          <w:rFonts w:ascii="Times New Roman" w:hAnsi="Times New Roman" w:cs="Times New Roman"/>
+          <w:sz w:val="24"/>
+          <w:szCs w:val="24"/>
           <w:lang w:val="pt-BR"/>
         </w:rPr>
         <w:t xml:space="preserve"/>
       </w:r>
       <w:r>
         <w:rPr>
-          <w:rFonts w:ascii="Microsoft Himalaya" w:hAnsi="Microsoft Himalaya" w:cs="Microsoft Himalaya"/>
-          <w:sz w:val="36"/>
-          <w:szCs w:val="36"/>
+          <w:rFonts w:ascii="Times New Roman" w:hAnsi="Times New Roman" w:cs="Times New Roman"/>
+          <w:sz w:val="24"/>
+          <w:szCs w:val="24"/>
           <w:lang w:val="pt-BR"/>
         </w:rPr>
         <w:t>)</w:t>
       </w:r>
       <w:r>
         <w:rPr>
-          <w:rFonts w:ascii="Microsoft Himalaya" w:hAnsi="Microsoft Himalaya" w:cs="Microsoft Himalaya"/>
-          <w:sz w:val="36"/>
-          <w:szCs w:val="36"/>
+          <w:rFonts w:ascii="Times New Roman" w:hAnsi="Times New Roman" w:cs="Times New Roman"/>
+          <w:sz w:val="24"/>
+          <w:szCs w:val="24"/>
           <w:lang w:val="pt-BR"/>
         </w:rPr>
         <w:t/>
       </w:r>
       <w:r>
         <w:rPr>
-          <w:rFonts w:ascii="Microsoft Himalaya" w:hAnsi="Microsoft Himalaya" w:cs="Microsoft Himalaya"/>
-          <w:sz w:val="36"/>
-          <w:szCs w:val="36"/>
+          <w:rFonts w:ascii="Times New Roman" w:hAnsi="Times New Roman" w:cs="Times New Roman"/>
+          <w:sz w:val="24"/>
+          <w:szCs w:val="24"/>
           <w:lang w:val="pt-BR"/>
         </w:rPr>
         <w:t xml:space="preserve"> Referente </w:t>
       </w:r>
       <w:r>
         <w:rPr>
-          <w:rFonts w:ascii="Microsoft Himalaya" w:hAnsi="Microsoft Himalaya" w:cs="Microsoft Himalaya"/>
-          <w:sz w:val="36"/>
-          <w:szCs w:val="36"/>
+          <w:rFonts w:ascii="Times New Roman" w:hAnsi="Times New Roman" w:cs="Times New Roman"/>
+          <w:sz w:val="24"/>
+          <w:szCs w:val="24"/>
           <w:lang w:val="pt-BR"/>
         </w:rPr>
         <w:t xml:space="preserve">serviço prestado de limpeza de porão no período de </w:t>
       </w:r>
       <w:r>
         <w:rPr>
-          <w:rFonts w:ascii="Microsoft Himalaya" w:hAnsi="Microsoft Himalaya" w:cs="Microsoft Himalaya"/>
-          <w:sz w:val="36"/>
-          <w:szCs w:val="36"/>
+          <w:rFonts w:ascii="Times New Roman" w:hAnsi="Times New Roman" w:cs="Times New Roman"/>
+          <w:sz w:val="24"/>
+          <w:szCs w:val="24"/>
           <w:lang w:val="pt-BR"/>
         </w:rPr>
         <w:t xml:space="preserve">{PERIODO}</w:t>
       </w:r>
       <w:r>
         <w:rPr>
-          <w:rFonts w:ascii="Microsoft Himalaya" w:hAnsi="Microsoft Himalaya" w:cs="Microsoft Himalaya"/>
-          <w:sz w:val="36"/>
-          <w:szCs w:val="36"/>
+          <w:rFonts w:ascii="Times New Roman" w:hAnsi="Times New Roman" w:cs="Times New Roman"/>
+          <w:sz w:val="24"/>
+          <w:szCs w:val="24"/>
           <w:lang w:val="pt-BR"/>
         </w:rPr>
         <w:t xml:space="preserve"/>
       </w:r>
       <w:r>
         <w:rPr>
-          <w:rFonts w:ascii="Microsoft Himalaya" w:hAnsi="Microsoft Himalaya" w:cs="Microsoft Himalaya"/>
-          <w:sz w:val="36"/>
-          <w:szCs w:val="36"/>
+          <w:rFonts w:ascii="Times New Roman" w:hAnsi="Times New Roman" w:cs="Times New Roman"/>
+          <w:sz w:val="24"/>
+          <w:szCs w:val="24"/>
           <w:lang w:val="pt-BR"/>
         </w:rPr>
         <w:t xml:space="preserve"/>
       </w:r>
       <w:r>
         <w:rPr>
-          <w:rFonts w:ascii="Microsoft Himalaya" w:hAnsi="Microsoft Himalaya" w:cs="Microsoft Himalaya"/>
-          <w:sz w:val="36"/>
-          <w:szCs w:val="36"/>
+          <w:rFonts w:ascii="Times New Roman" w:hAnsi="Times New Roman" w:cs="Times New Roman"/>
+          <w:sz w:val="24"/>
+          <w:szCs w:val="24"/>
           <w:lang w:val="pt-BR"/>
         </w:rPr>
         <w:t xml:space="preserve"/>
       </w:r>
       <w:r>
         <w:rPr>
-          <w:rFonts w:ascii="Microsoft Himalaya" w:hAnsi="Microsoft Himalaya" w:cs="Microsoft Himalaya"/>
-          <w:sz w:val="36"/>
-          <w:szCs w:val="36"/>
+          <w:rFonts w:ascii="Times New Roman" w:hAnsi="Times New Roman" w:cs="Times New Roman"/>
+          <w:sz w:val="24"/>
+          <w:szCs w:val="24"/>
           <w:lang w:val="pt-BR"/>
         </w:rPr>
         <w:t xml:space="preserve"/>
       </w:r>
       <w:r>
         <w:rPr>
-          <w:rFonts w:ascii="Microsoft Himalaya" w:hAnsi="Microsoft Himalaya" w:cs="Microsoft Himalaya"/>
-          <w:sz w:val="36"/>
-          <w:szCs w:val="36"/>
+          <w:rFonts w:ascii="Times New Roman" w:hAnsi="Times New Roman" w:cs="Times New Roman"/>
+          <w:sz w:val="24"/>
+          <w:szCs w:val="24"/>
           <w:lang w:val="pt-BR"/>
         </w:rPr>
         <w:t xml:space="preserve"/>
       </w:r>
       <w:r>
         <w:rPr>
-          <w:rFonts w:ascii="Microsoft Himalaya" w:hAnsi="Microsoft Himalaya" w:cs="Microsoft Himalaya"/>
-          <w:sz w:val="36"/>
-          <w:szCs w:val="36"/>
+          <w:rFonts w:ascii="Times New Roman" w:hAnsi="Times New Roman" w:cs="Times New Roman"/>
+          <w:sz w:val="24"/>
+          <w:szCs w:val="24"/>
           <w:lang w:val="pt-BR"/>
         </w:rPr>
         <w:t xml:space="preserve"/>
       </w:r>
       <w:r>
         <w:rPr>
-          <w:rFonts w:ascii="Microsoft Himalaya" w:hAnsi="Microsoft Himalaya" w:cs="Microsoft Himalaya"/>
-          <w:sz w:val="36"/>
-          <w:szCs w:val="36"/>
+          <w:rFonts w:ascii="Times New Roman" w:hAnsi="Times New Roman" w:cs="Times New Roman"/>
+          <w:sz w:val="24"/>
+          <w:szCs w:val="24"/>
           <w:lang w:val="pt-BR"/>
         </w:rPr>
         <w:t xml:space="preserve"/>
       </w:r>
       <w:r>
         <w:rPr>
-          <w:rFonts w:ascii="Microsoft Himalaya" w:hAnsi="Microsoft Himalaya" w:cs="Microsoft Himalaya"/>
-          <w:sz w:val="36"/>
-          <w:szCs w:val="36"/>
+          <w:rFonts w:ascii="Times New Roman" w:hAnsi="Times New Roman" w:cs="Times New Roman"/>
+          <w:sz w:val="24"/>
+          <w:szCs w:val="24"/>
           <w:lang w:val="pt-BR"/>
         </w:rPr>
         <w:t/>
       </w:r>
       <w:r>
         <w:rPr>
-          <w:rFonts w:ascii="Microsoft Himalaya" w:hAnsi="Microsoft Himalaya" w:cs="Microsoft Himalaya"/>
-          <w:sz w:val="36"/>
-          <w:szCs w:val="36"/>
+          <w:rFonts w:ascii="Times New Roman" w:hAnsi="Times New Roman" w:cs="Times New Roman"/>
+          <w:sz w:val="24"/>
+          <w:szCs w:val="24"/>
           <w:lang w:val="pt-BR"/>
         </w:rPr>
         <w:t>, dando-lhe por este recibo a devida quitação.</w:t>
@@ -619,18 +619,18 @@
       </w:pPr>
       <w:r>
         <w:rPr>
-          <w:rFonts w:ascii="Microsoft Himalaya" w:hAnsi="Microsoft Himalaya" w:cs="Microsoft Himalaya"/>
-          <w:sz w:val="36"/>
-          <w:szCs w:val="36"/>
+          <w:rFonts w:ascii="Times New Roman" w:hAnsi="Times New Roman" w:cs="Times New Roman"/>
+          <w:sz w:val="24"/>
+          <w:szCs w:val="24"/>
           <w:lang w:val="pt-BR"/>
         </w:rPr>
         <w:t/>
       </w:r>
       <w:r>
         <w:rPr>
-          <w:rFonts w:ascii="Microsoft Himalaya" w:hAnsi="Microsoft Himalaya" w:cs="Microsoft Himalaya"/>
-          <w:sz w:val="36"/>
-          <w:szCs w:val="36"/>
+          <w:rFonts w:ascii="Times New Roman" w:hAnsi="Times New Roman" w:cs="Times New Roman"/>
+          <w:sz w:val="24"/>
+          <w:szCs w:val="24"/>
           <w:lang w:val="pt-BR"/>
         </w:rPr>
         <w:t>{NOME}</w:t>
@@ -669,20 +669,20 @@
       </w:r>
       <w:r>
         <w:rPr>
-          <w:rFonts w:ascii="Microsoft Himalaya" w:hAnsi="Microsoft Himalaya" w:cs="Microsoft Himalaya"/>
+          <w:rFonts w:ascii="Times New Roman" w:hAnsi="Times New Roman" w:cs="Times New Roman"/>
           <w:color w:val="000000"/>
-          <w:sz w:val="32"/>
-          <w:szCs w:val="32"/>
+          <w:sz w:val="24"/>
+          <w:szCs w:val="24"/>
           <w:lang w:val="pt-BR" w:eastAsia="pt-BR"/>
         </w:rPr>
         <w:t>{CPFNUM}</w:t>
       </w:r>
       <w:r>
         <w:rPr>
-          <w:rFonts w:ascii="Microsoft Himalaya" w:hAnsi="Microsoft Himalaya" w:cs="Microsoft Himalaya"/>
+          <w:rFonts w:ascii="Times New Roman" w:hAnsi="Times New Roman" w:cs="Times New Roman"/>
           <w:color w:val="000000"/>
-          <w:sz w:val="32"/>
-          <w:szCs w:val="32"/>
+          <w:sz w:val="24"/>
+          <w:szCs w:val="24"/>
           <w:lang w:val="pt-BR" w:eastAsia="pt-BR"/>
         </w:rPr>
         <w:t/>

</xml_diff>